<commit_message>
Cable car Method B: updated SVGs, seed scripts, manual v7
</commit_message>
<xml_diff>
--- a/SpeakUp_TeacherGuide_v5.docx
+++ b/SpeakUp_TeacherGuide_v5.docx
@@ -8516,10 +8516,10 @@
     </w:p>
     <w:p>
       <w:pPr>
-        <w:spacing w:after="80"/>
-      </w:pPr>
-      <w:r>
-        <w:t xml:space="preserve">What is public speaking, where is it done, why does it matter</w:t>
+        <w:spacing w:after="100"/>
+      </w:pPr>
+      <w:r>
+        <w:t xml:space="preserve">In this first session, students discover where public speaking lives in the real world, meet the course's three pillars — Voice, Body, and Mind — and co-create the class norms they will live by all year. You will model every activity first, so the expectation is clear and your own courage is visible from minute one.</w:t>
       </w:r>
     </w:p>
     <w:p>
@@ -8536,46 +8536,250 @@
           <w:sz w:val="22"/>
           <w:szCs w:val="22"/>
         </w:rPr>
-        <w:t xml:space="preserve">OBJECTIVES</w:t>
-      </w:r>
-    </w:p>
-    <w:p>
-      <w:pPr>
-        <w:pStyle w:val="ListParagraph"/>
-        <w:numPr>
-          <w:ilvl w:val="0"/>
-          <w:numId w:val="1"/>
-        </w:numPr>
-        <w:spacing w:after="40"/>
-      </w:pPr>
-      <w:r>
-        <w:t xml:space="preserve">Students identify diverse real-world contexts for public speaking</w:t>
-      </w:r>
-    </w:p>
-    <w:p>
-      <w:pPr>
-        <w:pStyle w:val="ListParagraph"/>
-        <w:numPr>
-          <w:ilvl w:val="0"/>
-          <w:numId w:val="1"/>
-        </w:numPr>
-        <w:spacing w:after="40"/>
-      </w:pPr>
-      <w:r>
-        <w:t xml:space="preserve">Students understand speaking is a skill set, not a talent</w:t>
-      </w:r>
-    </w:p>
-    <w:p>
-      <w:pPr>
-        <w:pStyle w:val="ListParagraph"/>
-        <w:numPr>
-          <w:ilvl w:val="0"/>
-          <w:numId w:val="1"/>
-        </w:numPr>
-        <w:spacing w:after="40"/>
-      </w:pPr>
-      <w:r>
-        <w:t xml:space="preserve">Students establish class norms and share a 30-second introduction</w:t>
+        <w:t xml:space="preserve">WARM-UP (0–8 min) · 30-Second Introductions</w:t>
+      </w:r>
+    </w:p>
+    <w:p>
+      <w:pPr>
+        <w:spacing w:after="60"/>
+      </w:pPr>
+      <w:r>
+        <w:t xml:space="preserve">Purpose: Break the ice immediately. Every student stands up on Day 1 — no exceptions.</w:t>
+      </w:r>
+    </w:p>
+    <w:p>
+      <w:pPr>
+        <w:spacing w:after="80"/>
+      </w:pPr>
+      <w:r>
+        <w:t xml:space="preserve">Setup: Clear a speaking spot at the front. Set a visible timer (phone or clock). Tell students they will watch you go first.</w:t>
+      </w:r>
+    </w:p>
+    <w:p>
+      <w:pPr>
+        <w:spacing w:after="40"/>
+      </w:pPr>
+      <w:r>
+        <w:rPr>
+          <w:b/>
+          <w:bCs/>
+        </w:rPr>
+        <w:t xml:space="preserve">Teacher goes first — model the format:</w:t>
+      </w:r>
+    </w:p>
+    <w:p>
+      <w:pPr>
+        <w:shd w:fill="2E5E8E" w:val="clear"/>
+        <w:spacing w:after="0" w:before="120"/>
+        <w:ind w:left="120"/>
+      </w:pPr>
+      <w:r>
+        <w:rPr>
+          <w:b/>
+          <w:bCs/>
+          <w:color w:val="ffffff"/>
+          <w:sz w:val="18"/>
+          <w:szCs w:val="18"/>
+        </w:rPr>
+        <w:t xml:space="preserve">SAY →</w:t>
+      </w:r>
+    </w:p>
+    <w:p>
+      <w:pPr>
+        <w:shd w:fill="EBF3FB" w:val="clear"/>
+        <w:spacing w:after="20"/>
+        <w:ind w:left="120"/>
+      </w:pPr>
+      <w:r>
+        <w:rPr>
+          <w:i/>
+          <w:iCs/>
+          <w:color w:val="1A3A5C"/>
+          <w:sz w:val="20"/>
+          <w:szCs w:val="20"/>
+        </w:rPr>
+        <w:t xml:space="preserve">"I'm going to set a 30-second timer and give you: my name, one surprising fact about myself, and why I believe public speaking matters. Watch me — then each of you will do the same. Ready?"</w:t>
+      </w:r>
+    </w:p>
+    <w:p>
+      <w:pPr>
+        <w:shd w:fill="EBF3FB" w:val="clear"/>
+        <w:spacing w:after="20"/>
+        <w:ind w:left="120"/>
+      </w:pPr>
+      <w:r>
+        <w:rPr>
+          <w:i/>
+          <w:iCs/>
+          <w:color w:val="1A3A5C"/>
+          <w:sz w:val="20"/>
+          <w:szCs w:val="20"/>
+        </w:rPr>
+        <w:t xml:space="preserve">[Model: name + fact + reason. Aim for 25–30 seconds. Stop when timer ends.]</w:t>
+      </w:r>
+    </w:p>
+    <w:p>
+      <w:pPr>
+        <w:shd w:fill="EBF3FB" w:val="clear"/>
+        <w:spacing w:after="20"/>
+        <w:ind w:left="120"/>
+      </w:pPr>
+      <w:r>
+        <w:rPr>
+          <w:i/>
+          <w:iCs/>
+          <w:color w:val="1A3A5C"/>
+          <w:sz w:val="20"/>
+          <w:szCs w:val="20"/>
+        </w:rPr>
+        <w:t xml:space="preserve">"When I finish, give me snaps. That is how we show appreciation in this room. Snaps say: I hear you; I honor you. Every speaker gets snaps — every time."</w:t>
+      </w:r>
+    </w:p>
+    <w:p>
+      <w:pPr>
+        <w:shd w:fill="EBF3FB" w:val="clear"/>
+        <w:spacing w:after="100"/>
+      </w:pPr>
+    </w:p>
+    <w:p>
+      <w:pPr>
+        <w:spacing w:after="40"/>
+      </w:pPr>
+      <w:r>
+        <w:rPr>
+          <w:b/>
+          <w:bCs/>
+        </w:rPr>
+        <w:t xml:space="preserve">How to run student rounds:</w:t>
+      </w:r>
+    </w:p>
+    <w:p>
+      <w:pPr>
+        <w:pStyle w:val="ListParagraph"/>
+        <w:numPr>
+          <w:ilvl w:val="0"/>
+          <w:numId w:val="1"/>
+        </w:numPr>
+        <w:spacing w:after="40"/>
+      </w:pPr>
+      <w:r>
+        <w:t xml:space="preserve">Call one student at a time. Set timer to 30 sec.</w:t>
+      </w:r>
+    </w:p>
+    <w:p>
+      <w:pPr>
+        <w:pStyle w:val="ListParagraph"/>
+        <w:numPr>
+          <w:ilvl w:val="0"/>
+          <w:numId w:val="1"/>
+        </w:numPr>
+        <w:spacing w:after="40"/>
+      </w:pPr>
+      <w:r>
+        <w:t xml:space="preserve">Student stands, faces the class, delivers intro.</w:t>
+      </w:r>
+    </w:p>
+    <w:p>
+      <w:pPr>
+        <w:pStyle w:val="ListParagraph"/>
+        <w:numPr>
+          <w:ilvl w:val="0"/>
+          <w:numId w:val="1"/>
+        </w:numPr>
+        <w:spacing w:after="40"/>
+      </w:pPr>
+      <w:r>
+        <w:t xml:space="preserve">Class snaps after every speaker.</w:t>
+      </w:r>
+    </w:p>
+    <w:p>
+      <w:pPr>
+        <w:pStyle w:val="ListParagraph"/>
+        <w:numPr>
+          <w:ilvl w:val="0"/>
+          <w:numId w:val="1"/>
+        </w:numPr>
+        <w:spacing w:after="40"/>
+      </w:pPr>
+      <w:r>
+        <w:t xml:space="preserve">Teacher says only: "Thank you, [name]." — no coaching yet.</w:t>
+      </w:r>
+    </w:p>
+    <w:p>
+      <w:pPr>
+        <w:pStyle w:val="ListParagraph"/>
+        <w:numPr>
+          <w:ilvl w:val="0"/>
+          <w:numId w:val="1"/>
+        </w:numPr>
+        <w:spacing w:after="40"/>
+      </w:pPr>
+      <w:r>
+        <w:t xml:space="preserve">If student goes over time, let them finish, then note gently: "We will work on that 30-second instinct."</w:t>
+      </w:r>
+    </w:p>
+    <w:p>
+      <w:pPr>
+        <w:pStyle w:val="ListParagraph"/>
+        <w:numPr>
+          <w:ilvl w:val="0"/>
+          <w:numId w:val="1"/>
+        </w:numPr>
+        <w:spacing w:after="40"/>
+      </w:pPr>
+      <w:r>
+        <w:t xml:space="preserve">If student freezes: "Take your time. We've got you." Wait 5 seconds, then offer: "Name, one fact, why you're here."</w:t>
+      </w:r>
+    </w:p>
+    <w:p>
+      <w:pPr>
+        <w:spacing w:after="40"/>
+      </w:pPr>
+      <w:r>
+        <w:rPr>
+          <w:b/>
+          <w:bCs/>
+        </w:rPr>
+        <w:t xml:space="preserve">State these ground rules aloud before the first student stands:</w:t>
+      </w:r>
+    </w:p>
+    <w:p>
+      <w:pPr>
+        <w:pStyle w:val="ListParagraph"/>
+        <w:numPr>
+          <w:ilvl w:val="0"/>
+          <w:numId w:val="1"/>
+        </w:numPr>
+        <w:spacing w:after="40"/>
+      </w:pPr>
+      <w:r>
+        <w:t xml:space="preserve">Audience is silent while someone is speaking.</w:t>
+      </w:r>
+    </w:p>
+    <w:p>
+      <w:pPr>
+        <w:pStyle w:val="ListParagraph"/>
+        <w:numPr>
+          <w:ilvl w:val="0"/>
+          <w:numId w:val="1"/>
+        </w:numPr>
+        <w:spacing w:after="40"/>
+      </w:pPr>
+      <w:r>
+        <w:t xml:space="preserve">Snaps after every speaker — no exceptions.</w:t>
+      </w:r>
+    </w:p>
+    <w:p>
+      <w:pPr>
+        <w:pStyle w:val="ListParagraph"/>
+        <w:numPr>
+          <w:ilvl w:val="0"/>
+          <w:numId w:val="1"/>
+        </w:numPr>
+        <w:spacing w:after="40"/>
+      </w:pPr>
+      <w:r>
+        <w:t xml:space="preserve">No coaching, no laughing. Today we are just building the muscle of standing up front.</w:t>
       </w:r>
     </w:p>
     <w:p>
@@ -8592,68 +8796,792 @@
           <w:sz w:val="22"/>
           <w:szCs w:val="22"/>
         </w:rPr>
-        <w:t xml:space="preserve">WARM-UP (8 min) — 30-Second Introduction</w:t>
-      </w:r>
-    </w:p>
-    <w:p>
-      <w:pPr>
-        <w:spacing w:after="80"/>
-      </w:pPr>
-      <w:r>
-        <w:t xml:space="preserve">Each student introduces themselves — their first real public speaking moment.</w:t>
-      </w:r>
-    </w:p>
-    <w:p>
-      <w:pPr>
-        <w:pStyle w:val="ListParagraph"/>
-        <w:numPr>
-          <w:ilvl w:val="0"/>
-          <w:numId w:val="1"/>
-        </w:numPr>
-        <w:spacing w:after="40"/>
-      </w:pPr>
-      <w:r>
-        <w:t xml:space="preserve">Teacher models: name + one surprising fact + why you are here.</w:t>
-      </w:r>
-    </w:p>
-    <w:p>
-      <w:pPr>
-        <w:pStyle w:val="ListParagraph"/>
-        <w:numPr>
-          <w:ilvl w:val="0"/>
-          <w:numId w:val="1"/>
-        </w:numPr>
-        <w:spacing w:after="40"/>
-      </w:pPr>
-      <w:r>
-        <w:t xml:space="preserve">Each student stands, faces the class, gives their 30-second intro.</w:t>
-      </w:r>
-    </w:p>
-    <w:p>
-      <w:pPr>
-        <w:pStyle w:val="ListParagraph"/>
-        <w:numPr>
-          <w:ilvl w:val="0"/>
-          <w:numId w:val="1"/>
-        </w:numPr>
-        <w:spacing w:after="40"/>
-      </w:pPr>
-      <w:r>
-        <w:t xml:space="preserve">Ground rule: audience is silent and supportive. Snaps for every speaker.</w:t>
-      </w:r>
-    </w:p>
-    <w:p>
-      <w:pPr>
-        <w:pStyle w:val="ListParagraph"/>
-        <w:numPr>
-          <w:ilvl w:val="0"/>
-          <w:numId w:val="1"/>
-        </w:numPr>
-        <w:spacing w:after="40"/>
-      </w:pPr>
-      <w:r>
-        <w:t xml:space="preserve">No feedback today — just build the muscle of standing at the front.</w:t>
-      </w:r>
+        <w:t xml:space="preserve">MAIN ACTIVITY (8–52 min)</w:t>
+      </w:r>
+    </w:p>
+    <w:p>
+      <w:pPr>
+        <w:spacing w:after="40"/>
+      </w:pPr>
+      <w:r>
+        <w:rPr>
+          <w:b/>
+          <w:bCs/>
+        </w:rPr>
+        <w:t xml:space="preserve">Part 1 (8–20 min): Where Do People Speak Publicly? — Brainstorm</w:t>
+      </w:r>
+    </w:p>
+    <w:p>
+      <w:pPr>
+        <w:spacing w:after="60"/>
+      </w:pPr>
+      <w:r>
+        <w:t xml:space="preserve">Purpose: Expand students' frame beyond "class presentations." Public speaking is everywhere — and they are already doing it.</w:t>
+      </w:r>
+    </w:p>
+    <w:p>
+      <w:pPr>
+        <w:spacing w:after="40"/>
+      </w:pPr>
+      <w:r>
+        <w:rPr>
+          <w:b/>
+          <w:bCs/>
+        </w:rPr>
+        <w:t xml:space="preserve">Facilitating the brainstorm:</w:t>
+      </w:r>
+    </w:p>
+    <w:p>
+      <w:pPr>
+        <w:shd w:fill="2E5E8E" w:val="clear"/>
+        <w:spacing w:after="0" w:before="120"/>
+        <w:ind w:left="120"/>
+      </w:pPr>
+      <w:r>
+        <w:rPr>
+          <w:b/>
+          <w:bCs/>
+          <w:color w:val="ffffff"/>
+          <w:sz w:val="18"/>
+          <w:szCs w:val="18"/>
+        </w:rPr>
+        <w:t xml:space="preserve">SAY →</w:t>
+      </w:r>
+    </w:p>
+    <w:p>
+      <w:pPr>
+        <w:shd w:fill="EBF3FB" w:val="clear"/>
+        <w:spacing w:after="20"/>
+        <w:ind w:left="120"/>
+      </w:pPr>
+      <w:r>
+        <w:rPr>
+          <w:i/>
+          <w:iCs/>
+          <w:color w:val="1A3A5C"/>
+          <w:sz w:val="20"/>
+          <w:szCs w:val="20"/>
+        </w:rPr>
+        <w:t xml:space="preserve">"Where in the world do people speak in front of others? Shout it out — I will write everything on the board."</w:t>
+      </w:r>
+    </w:p>
+    <w:p>
+      <w:pPr>
+        <w:shd w:fill="EBF3FB" w:val="clear"/>
+        <w:spacing w:after="100"/>
+      </w:pPr>
+    </w:p>
+    <w:p>
+      <w:pPr>
+        <w:pStyle w:val="ListParagraph"/>
+        <w:numPr>
+          <w:ilvl w:val="0"/>
+          <w:numId w:val="1"/>
+        </w:numPr>
+        <w:spacing w:after="40"/>
+      </w:pPr>
+      <w:r>
+        <w:t xml:space="preserve">Write fast, accept everything. Aim for 20+ ideas in 4–5 minutes.</w:t>
+      </w:r>
+    </w:p>
+    <w:p>
+      <w:pPr>
+        <w:pStyle w:val="ListParagraph"/>
+        <w:numPr>
+          <w:ilvl w:val="0"/>
+          <w:numId w:val="1"/>
+        </w:numPr>
+        <w:spacing w:after="40"/>
+      </w:pPr>
+      <w:r>
+        <w:t xml:space="preserve">Then ask: "What do these have in common? Can we group them into categories?"</w:t>
+      </w:r>
+    </w:p>
+    <w:p>
+      <w:pPr>
+        <w:spacing w:after="40"/>
+      </w:pPr>
+      <w:r>
+        <w:rPr>
+          <w:b/>
+          <w:bCs/>
+        </w:rPr>
+        <w:t xml:space="preserve">Categories to guide toward (draw circles or boxes on the board):</w:t>
+      </w:r>
+    </w:p>
+    <w:p>
+      <w:pPr>
+        <w:pStyle w:val="ListParagraph"/>
+        <w:numPr>
+          <w:ilvl w:val="0"/>
+          <w:numId w:val="1"/>
+        </w:numPr>
+        <w:spacing w:after="40"/>
+      </w:pPr>
+      <w:r>
+        <w:t xml:space="preserve">Justice &amp; government — courtrooms, town halls, Senate hearings, rallies</w:t>
+      </w:r>
+    </w:p>
+    <w:p>
+      <w:pPr>
+        <w:pStyle w:val="ListParagraph"/>
+        <w:numPr>
+          <w:ilvl w:val="0"/>
+          <w:numId w:val="1"/>
+        </w:numPr>
+        <w:spacing w:after="40"/>
+      </w:pPr>
+      <w:r>
+        <w:t xml:space="preserve">Business &amp; career — job interviews, pitches, press conferences, team meetings</w:t>
+      </w:r>
+    </w:p>
+    <w:p>
+      <w:pPr>
+        <w:pStyle w:val="ListParagraph"/>
+        <w:numPr>
+          <w:ilvl w:val="0"/>
+          <w:numId w:val="1"/>
+        </w:numPr>
+        <w:spacing w:after="40"/>
+      </w:pPr>
+      <w:r>
+        <w:t xml:space="preserve">Community &amp; faith — religious services, funerals, community organizing</w:t>
+      </w:r>
+    </w:p>
+    <w:p>
+      <w:pPr>
+        <w:pStyle w:val="ListParagraph"/>
+        <w:numPr>
+          <w:ilvl w:val="0"/>
+          <w:numId w:val="1"/>
+        </w:numPr>
+        <w:spacing w:after="40"/>
+      </w:pPr>
+      <w:r>
+        <w:t xml:space="preserve">Media &amp; entertainment — podcasts, YouTube, standup comedy, TEDx, news</w:t>
+      </w:r>
+    </w:p>
+    <w:p>
+      <w:pPr>
+        <w:pStyle w:val="ListParagraph"/>
+        <w:numPr>
+          <w:ilvl w:val="0"/>
+          <w:numId w:val="1"/>
+        </w:numPr>
+        <w:spacing w:after="40"/>
+      </w:pPr>
+      <w:r>
+        <w:t xml:space="preserve">Everyday life — wedding toasts, graduation speeches, giving directions, parent meetings</w:t>
+      </w:r>
+    </w:p>
+    <w:p>
+      <w:pPr>
+        <w:spacing w:after="40"/>
+      </w:pPr>
+      <w:r>
+        <w:rPr>
+          <w:b/>
+          <w:bCs/>
+        </w:rPr>
+        <w:t xml:space="preserve">Close the brainstorm:</w:t>
+      </w:r>
+    </w:p>
+    <w:p>
+      <w:pPr>
+        <w:shd w:fill="2E5E8E" w:val="clear"/>
+        <w:spacing w:after="0" w:before="120"/>
+        <w:ind w:left="120"/>
+      </w:pPr>
+      <w:r>
+        <w:rPr>
+          <w:b/>
+          <w:bCs/>
+          <w:color w:val="ffffff"/>
+          <w:sz w:val="18"/>
+          <w:szCs w:val="18"/>
+        </w:rPr>
+        <w:t xml:space="preserve">SAY →</w:t>
+      </w:r>
+    </w:p>
+    <w:p>
+      <w:pPr>
+        <w:shd w:fill="EBF3FB" w:val="clear"/>
+        <w:spacing w:after="20"/>
+        <w:ind w:left="120"/>
+      </w:pPr>
+      <w:r>
+        <w:rPr>
+          <w:i/>
+          <w:iCs/>
+          <w:color w:val="1A3A5C"/>
+          <w:sz w:val="20"/>
+          <w:szCs w:val="20"/>
+        </w:rPr>
+        <w:t xml:space="preserve">"You are all already public speakers. This class just makes you better at something you are already doing."</w:t>
+      </w:r>
+    </w:p>
+    <w:p>
+      <w:pPr>
+        <w:shd w:fill="EBF3FB" w:val="clear"/>
+        <w:spacing w:after="100"/>
+      </w:pPr>
+    </w:p>
+    <w:p>
+      <w:pPr>
+        <w:spacing w:after="40"/>
+      </w:pPr>
+      <w:r>
+        <w:rPr>
+          <w:b/>
+          <w:bCs/>
+        </w:rPr>
+        <w:t xml:space="preserve">Part 2 (20–38 min): The 3 Pillars — Voice, Body, Mind</w:t>
+      </w:r>
+    </w:p>
+    <w:p>
+      <w:pPr>
+        <w:spacing w:after="60"/>
+      </w:pPr>
+      <w:r>
+        <w:t xml:space="preserve">Purpose: Introduce the course's organizing framework through live teacher demos — bad version first, then good.</w:t>
+      </w:r>
+    </w:p>
+    <w:p>
+      <w:pPr>
+        <w:shd w:fill="2E5E8E" w:val="clear"/>
+        <w:spacing w:after="0" w:before="120"/>
+        <w:ind w:left="120"/>
+      </w:pPr>
+      <w:r>
+        <w:rPr>
+          <w:b/>
+          <w:bCs/>
+          <w:color w:val="ffffff"/>
+          <w:sz w:val="18"/>
+          <w:szCs w:val="18"/>
+        </w:rPr>
+        <w:t xml:space="preserve">SAY →</w:t>
+      </w:r>
+    </w:p>
+    <w:p>
+      <w:pPr>
+        <w:shd w:fill="EBF3FB" w:val="clear"/>
+        <w:spacing w:after="20"/>
+        <w:ind w:left="120"/>
+      </w:pPr>
+      <w:r>
+        <w:rPr>
+          <w:i/>
+          <w:iCs/>
+          <w:color w:val="1A3A5C"/>
+          <w:sz w:val="20"/>
+          <w:szCs w:val="20"/>
+        </w:rPr>
+        <w:t xml:space="preserve">"Every great public speaker uses three tools. We call them the 3 Pillars: Voice, Body, and Mind. I am going to show you each pillar at its worst — and then at its best. Your job: watch and notice what changes."</w:t>
+      </w:r>
+    </w:p>
+    <w:p>
+      <w:pPr>
+        <w:shd w:fill="EBF3FB" w:val="clear"/>
+        <w:spacing w:after="100"/>
+      </w:pPr>
+    </w:p>
+    <w:p>
+      <w:pPr>
+        <w:spacing w:after="40"/>
+      </w:pPr>
+      <w:r>
+        <w:rPr>
+          <w:b/>
+          <w:bCs/>
+        </w:rPr>
+        <w:t xml:space="preserve">VOICE (6 min):</w:t>
+      </w:r>
+    </w:p>
+    <w:p>
+      <w:pPr>
+        <w:pStyle w:val="ListParagraph"/>
+        <w:numPr>
+          <w:ilvl w:val="0"/>
+          <w:numId w:val="1"/>
+        </w:numPr>
+        <w:spacing w:after="40"/>
+      </w:pPr>
+      <w:r>
+        <w:t xml:space="preserve">Demo bad first: drop to a mumble, look at the floor, rush your words.</w:t>
+      </w:r>
+    </w:p>
+    <w:p>
+      <w:pPr>
+        <w:pStyle w:val="ListParagraph"/>
+        <w:numPr>
+          <w:ilvl w:val="0"/>
+          <w:numId w:val="1"/>
+        </w:numPr>
+        <w:spacing w:after="40"/>
+      </w:pPr>
+      <w:r>
+        <w:t xml:space="preserve">Ask: "What did you notice? What made that hard to listen to?"</w:t>
+      </w:r>
+    </w:p>
+    <w:p>
+      <w:pPr>
+        <w:pStyle w:val="ListParagraph"/>
+        <w:numPr>
+          <w:ilvl w:val="0"/>
+          <w:numId w:val="1"/>
+        </w:numPr>
+        <w:spacing w:after="40"/>
+      </w:pPr>
+      <w:r>
+        <w:t xml:space="preserve">Demo good: project clearly, pause after key words, vary your pace. Make deliberate eye contact.</w:t>
+      </w:r>
+    </w:p>
+    <w:p>
+      <w:pPr>
+        <w:pStyle w:val="ListParagraph"/>
+        <w:numPr>
+          <w:ilvl w:val="0"/>
+          <w:numId w:val="1"/>
+        </w:numPr>
+        <w:spacing w:after="40"/>
+      </w:pPr>
+      <w:r>
+        <w:t xml:space="preserve">Ask: "What was different? What made it easier to follow?"</w:t>
+      </w:r>
+    </w:p>
+    <w:p>
+      <w:pPr>
+        <w:pStyle w:val="ListParagraph"/>
+        <w:numPr>
+          <w:ilvl w:val="0"/>
+          <w:numId w:val="1"/>
+        </w:numPr>
+        <w:spacing w:after="40"/>
+      </w:pPr>
+      <w:r>
+        <w:t xml:space="preserve">Write on board: VOICE = Volume · Pace · Clarity · Expression</w:t>
+      </w:r>
+    </w:p>
+    <w:p>
+      <w:pPr>
+        <w:spacing w:after="40"/>
+      </w:pPr>
+      <w:r>
+        <w:rPr>
+          <w:b/>
+          <w:bCs/>
+        </w:rPr>
+        <w:t xml:space="preserve">BODY (6 min):</w:t>
+      </w:r>
+    </w:p>
+    <w:p>
+      <w:pPr>
+        <w:pStyle w:val="ListParagraph"/>
+        <w:numPr>
+          <w:ilvl w:val="0"/>
+          <w:numId w:val="1"/>
+        </w:numPr>
+        <w:spacing w:after="40"/>
+      </w:pPr>
+      <w:r>
+        <w:t xml:space="preserve">Demo bad first: slump, fidget with your hands, avoid eye contact, stand sideways.</w:t>
+      </w:r>
+    </w:p>
+    <w:p>
+      <w:pPr>
+        <w:pStyle w:val="ListParagraph"/>
+        <w:numPr>
+          <w:ilvl w:val="0"/>
+          <w:numId w:val="1"/>
+        </w:numPr>
+        <w:spacing w:after="40"/>
+      </w:pPr>
+      <w:r>
+        <w:t xml:space="preserve">Demo good: plant feet shoulder-width, open posture, make eye contact with three different students across the room.</w:t>
+      </w:r>
+    </w:p>
+    <w:p>
+      <w:pPr>
+        <w:pStyle w:val="ListParagraph"/>
+        <w:numPr>
+          <w:ilvl w:val="0"/>
+          <w:numId w:val="1"/>
+        </w:numPr>
+        <w:spacing w:after="40"/>
+      </w:pPr>
+      <w:r>
+        <w:t xml:space="preserve">Ask: "Did the second version feel more credible? Why do you think that is?"</w:t>
+      </w:r>
+    </w:p>
+    <w:p>
+      <w:pPr>
+        <w:pStyle w:val="ListParagraph"/>
+        <w:numPr>
+          <w:ilvl w:val="0"/>
+          <w:numId w:val="1"/>
+        </w:numPr>
+        <w:spacing w:after="40"/>
+      </w:pPr>
+      <w:r>
+        <w:t xml:space="preserve">Write on board: BODY = Posture · Gestures · Eye Contact · Space</w:t>
+      </w:r>
+    </w:p>
+    <w:p>
+      <w:pPr>
+        <w:spacing w:after="40"/>
+      </w:pPr>
+      <w:r>
+        <w:rPr>
+          <w:b/>
+          <w:bCs/>
+        </w:rPr>
+        <w:t xml:space="preserve">MIND (4 min):</w:t>
+      </w:r>
+    </w:p>
+    <w:p>
+      <w:pPr>
+        <w:shd w:fill="2E5E8E" w:val="clear"/>
+        <w:spacing w:after="0" w:before="120"/>
+        <w:ind w:left="120"/>
+      </w:pPr>
+      <w:r>
+        <w:rPr>
+          <w:b/>
+          <w:bCs/>
+          <w:color w:val="ffffff"/>
+          <w:sz w:val="18"/>
+          <w:szCs w:val="18"/>
+        </w:rPr>
+        <w:t xml:space="preserve">SAY →</w:t>
+      </w:r>
+    </w:p>
+    <w:p>
+      <w:pPr>
+        <w:shd w:fill="EBF3FB" w:val="clear"/>
+        <w:spacing w:after="20"/>
+        <w:ind w:left="120"/>
+      </w:pPr>
+      <w:r>
+        <w:rPr>
+          <w:i/>
+          <w:iCs/>
+          <w:color w:val="1A3A5C"/>
+          <w:sz w:val="20"/>
+          <w:szCs w:val="20"/>
+        </w:rPr>
+        <w:t xml:space="preserve">"The third pillar is invisible — it lives in here." [Point to your head.] "It is confidence, emotional connection, preparation, and focus. A speaker with a great voice and great body but a checked-out mind is just performing. The mind is what makes it real."</w:t>
+      </w:r>
+    </w:p>
+    <w:p>
+      <w:pPr>
+        <w:shd w:fill="EBF3FB" w:val="clear"/>
+        <w:spacing w:after="100"/>
+      </w:pPr>
+    </w:p>
+    <w:p>
+      <w:pPr>
+        <w:pStyle w:val="ListParagraph"/>
+        <w:numPr>
+          <w:ilvl w:val="0"/>
+          <w:numId w:val="1"/>
+        </w:numPr>
+        <w:spacing w:after="40"/>
+      </w:pPr>
+      <w:r>
+        <w:t xml:space="preserve">Write on board: MIND = Confidence · Connection · Preparation · Focus</w:t>
+      </w:r>
+    </w:p>
+    <w:p>
+      <w:pPr>
+        <w:spacing w:after="40"/>
+      </w:pPr>
+      <w:r>
+        <w:rPr>
+          <w:b/>
+          <w:bCs/>
+        </w:rPr>
+        <w:t xml:space="preserve">Bring it together:</w:t>
+      </w:r>
+    </w:p>
+    <w:p>
+      <w:pPr>
+        <w:shd w:fill="2E5E8E" w:val="clear"/>
+        <w:spacing w:after="0" w:before="120"/>
+        <w:ind w:left="120"/>
+      </w:pPr>
+      <w:r>
+        <w:rPr>
+          <w:b/>
+          <w:bCs/>
+          <w:color w:val="ffffff"/>
+          <w:sz w:val="18"/>
+          <w:szCs w:val="18"/>
+        </w:rPr>
+        <w:t xml:space="preserve">SAY →</w:t>
+      </w:r>
+    </w:p>
+    <w:p>
+      <w:pPr>
+        <w:shd w:fill="EBF3FB" w:val="clear"/>
+        <w:spacing w:after="20"/>
+        <w:ind w:left="120"/>
+      </w:pPr>
+      <w:r>
+        <w:rPr>
+          <w:i/>
+          <w:iCs/>
+          <w:color w:val="1A3A5C"/>
+          <w:sz w:val="20"/>
+          <w:szCs w:val="20"/>
+        </w:rPr>
+        <w:t xml:space="preserve">"These three pillars are the foundation of everything we will do this year. Every week we will isolate one of them — but all three work together. By the end of the year you will feel the difference."</w:t>
+      </w:r>
+    </w:p>
+    <w:p>
+      <w:pPr>
+        <w:shd w:fill="EBF3FB" w:val="clear"/>
+        <w:spacing w:after="100"/>
+      </w:pPr>
+    </w:p>
+    <w:p>
+      <w:pPr>
+        <w:spacing w:after="80"/>
+      </w:pPr>
+      <w:r>
+        <w:rPr>
+          <w:i/>
+          <w:iCs/>
+          <w:color w:val="555555"/>
+        </w:rPr>
+        <w:t xml:space="preserve">Keep all three pillars visible on the board for the rest of the year — or put them on the wall.</w:t>
+      </w:r>
+    </w:p>
+    <w:p>
+      <w:pPr>
+        <w:spacing w:after="40"/>
+      </w:pPr>
+      <w:r>
+        <w:rPr>
+          <w:b/>
+          <w:bCs/>
+        </w:rPr>
+        <w:t xml:space="preserve">Part 3 (38–52 min): Co-Create Class Norms</w:t>
+      </w:r>
+    </w:p>
+    <w:p>
+      <w:pPr>
+        <w:spacing w:after="60"/>
+      </w:pPr>
+      <w:r>
+        <w:t xml:space="preserve">Purpose: Students who write the rules follow them. Buy-in is the whole point of this section.</w:t>
+      </w:r>
+    </w:p>
+    <w:p>
+      <w:pPr>
+        <w:spacing w:after="40"/>
+      </w:pPr>
+      <w:r>
+        <w:rPr>
+          <w:b/>
+          <w:bCs/>
+        </w:rPr>
+        <w:t xml:space="preserve">How to run it:</w:t>
+      </w:r>
+    </w:p>
+    <w:p>
+      <w:pPr>
+        <w:pStyle w:val="ListParagraph"/>
+        <w:numPr>
+          <w:ilvl w:val="0"/>
+          <w:numId w:val="1"/>
+        </w:numPr>
+        <w:spacing w:after="40"/>
+      </w:pPr>
+      <w:r>
+        <w:t xml:space="preserve">Ask: "What does the best possible audience look like — for a speaker who is scared?"</w:t>
+      </w:r>
+    </w:p>
+    <w:p>
+      <w:pPr>
+        <w:pStyle w:val="ListParagraph"/>
+        <w:numPr>
+          <w:ilvl w:val="0"/>
+          <w:numId w:val="1"/>
+        </w:numPr>
+        <w:spacing w:after="40"/>
+      </w:pPr>
+      <w:r>
+        <w:t xml:space="preserve">Take answers and write them on a large sticky note or poster sheet at the front.</w:t>
+      </w:r>
+    </w:p>
+    <w:p>
+      <w:pPr>
+        <w:pStyle w:val="ListParagraph"/>
+        <w:numPr>
+          <w:ilvl w:val="0"/>
+          <w:numId w:val="1"/>
+        </w:numPr>
+        <w:spacing w:after="40"/>
+      </w:pPr>
+      <w:r>
+        <w:t xml:space="preserve">After 8–10 contributions, cluster them into 3–5 norms. Read each one aloud.</w:t>
+      </w:r>
+    </w:p>
+    <w:p>
+      <w:pPr>
+        <w:pStyle w:val="ListParagraph"/>
+        <w:numPr>
+          <w:ilvl w:val="0"/>
+          <w:numId w:val="1"/>
+        </w:numPr>
+        <w:spacing w:after="40"/>
+      </w:pPr>
+      <w:r>
+        <w:t xml:space="preserve">Ask the class to vote with snaps if they agree. Only add norms with unanimous or near-unanimous snaps.</w:t>
+      </w:r>
+    </w:p>
+    <w:p>
+      <w:pPr>
+        <w:pStyle w:val="ListParagraph"/>
+        <w:numPr>
+          <w:ilvl w:val="0"/>
+          <w:numId w:val="1"/>
+        </w:numPr>
+        <w:spacing w:after="40"/>
+      </w:pPr>
+      <w:r>
+        <w:t xml:space="preserve">Title the poster: OUR ROOM RULES — put it on the wall today.</w:t>
+      </w:r>
+    </w:p>
+    <w:p>
+      <w:pPr>
+        <w:spacing w:after="40"/>
+      </w:pPr>
+      <w:r>
+        <w:rPr>
+          <w:b/>
+          <w:bCs/>
+        </w:rPr>
+        <w:t xml:space="preserve">Norms to guide toward if the class gets stuck:</w:t>
+      </w:r>
+    </w:p>
+    <w:p>
+      <w:pPr>
+        <w:pStyle w:val="ListParagraph"/>
+        <w:numPr>
+          <w:ilvl w:val="0"/>
+          <w:numId w:val="1"/>
+        </w:numPr>
+        <w:spacing w:after="40"/>
+      </w:pPr>
+      <w:r>
+        <w:t xml:space="preserve">We are silent when someone is speaking.</w:t>
+      </w:r>
+    </w:p>
+    <w:p>
+      <w:pPr>
+        <w:pStyle w:val="ListParagraph"/>
+        <w:numPr>
+          <w:ilvl w:val="0"/>
+          <w:numId w:val="1"/>
+        </w:numPr>
+        <w:spacing w:after="40"/>
+      </w:pPr>
+      <w:r>
+        <w:t xml:space="preserve">We snap or clap — we never laugh at a speaker.</w:t>
+      </w:r>
+    </w:p>
+    <w:p>
+      <w:pPr>
+        <w:pStyle w:val="ListParagraph"/>
+        <w:numPr>
+          <w:ilvl w:val="0"/>
+          <w:numId w:val="1"/>
+        </w:numPr>
+        <w:spacing w:after="40"/>
+      </w:pPr>
+      <w:r>
+        <w:t xml:space="preserve">We give feedback to help, not to show off.</w:t>
+      </w:r>
+    </w:p>
+    <w:p>
+      <w:pPr>
+        <w:pStyle w:val="ListParagraph"/>
+        <w:numPr>
+          <w:ilvl w:val="0"/>
+          <w:numId w:val="1"/>
+        </w:numPr>
+        <w:spacing w:after="40"/>
+      </w:pPr>
+      <w:r>
+        <w:t xml:space="preserve">We try even when it's scary — especially when it's scary.</w:t>
+      </w:r>
+    </w:p>
+    <w:p>
+      <w:pPr>
+        <w:pStyle w:val="ListParagraph"/>
+        <w:numPr>
+          <w:ilvl w:val="0"/>
+          <w:numId w:val="1"/>
+        </w:numPr>
+        <w:spacing w:after="40"/>
+      </w:pPr>
+      <w:r>
+        <w:t xml:space="preserve">We keep what is shared in this room in this room. [Optional for older G3-4 groups.]</w:t>
+      </w:r>
+    </w:p>
+    <w:p>
+      <w:pPr>
+        <w:spacing w:after="40"/>
+      </w:pPr>
+      <w:r>
+        <w:rPr>
+          <w:b/>
+          <w:bCs/>
+        </w:rPr>
+        <w:t xml:space="preserve">Close:</w:t>
+      </w:r>
+    </w:p>
+    <w:p>
+      <w:pPr>
+        <w:shd w:fill="2E5E8E" w:val="clear"/>
+        <w:spacing w:after="0" w:before="120"/>
+        <w:ind w:left="120"/>
+      </w:pPr>
+      <w:r>
+        <w:rPr>
+          <w:b/>
+          <w:bCs/>
+          <w:color w:val="ffffff"/>
+          <w:sz w:val="18"/>
+          <w:szCs w:val="18"/>
+        </w:rPr>
+        <w:t xml:space="preserve">SAY →</w:t>
+      </w:r>
+    </w:p>
+    <w:p>
+      <w:pPr>
+        <w:shd w:fill="EBF3FB" w:val="clear"/>
+        <w:spacing w:after="20"/>
+        <w:ind w:left="120"/>
+      </w:pPr>
+      <w:r>
+        <w:rPr>
+          <w:i/>
+          <w:iCs/>
+          <w:color w:val="1A3A5C"/>
+          <w:sz w:val="20"/>
+          <w:szCs w:val="20"/>
+        </w:rPr>
+        <w:t xml:space="preserve">"These are your rules. I did not write them — you did. I will hold you to them, and I expect you to hold each other to them too."</w:t>
+      </w:r>
+    </w:p>
+    <w:p>
+      <w:pPr>
+        <w:shd w:fill="EBF3FB" w:val="clear"/>
+        <w:spacing w:after="100"/>
+      </w:pPr>
     </w:p>
     <w:p>
       <w:pPr>
@@ -8669,203 +9597,216 @@
           <w:sz w:val="22"/>
           <w:szCs w:val="22"/>
         </w:rPr>
-        <w:t xml:space="preserve">MAIN ACTIVITY (40–45 min)</w:t>
-      </w:r>
-    </w:p>
-    <w:p>
-      <w:pPr>
-        <w:spacing w:after="80"/>
-      </w:pPr>
-      <w:r>
-        <w:rPr>
-          <w:b/>
-          <w:bCs/>
-        </w:rPr>
-        <w:t xml:space="preserve">Where Do People Speak Publicly?</w:t>
-      </w:r>
-    </w:p>
-    <w:p>
-      <w:pPr>
-        <w:spacing w:after="80"/>
-      </w:pPr>
-      <w:r>
-        <w:t xml:space="preserve">Brainstorm beyond class presentations:</w:t>
-      </w:r>
-    </w:p>
-    <w:p>
-      <w:pPr>
-        <w:pStyle w:val="ListParagraph"/>
-        <w:numPr>
-          <w:ilvl w:val="0"/>
-          <w:numId w:val="1"/>
-        </w:numPr>
-        <w:spacing w:after="40"/>
-      </w:pPr>
-      <w:r>
-        <w:t xml:space="preserve">Courtrooms, boardrooms, TED stages, graduation ceremonies</w:t>
-      </w:r>
-    </w:p>
-    <w:p>
-      <w:pPr>
-        <w:pStyle w:val="ListParagraph"/>
-        <w:numPr>
-          <w:ilvl w:val="0"/>
-          <w:numId w:val="1"/>
-        </w:numPr>
-        <w:spacing w:after="40"/>
-      </w:pPr>
-      <w:r>
-        <w:t xml:space="preserve">Town halls, religious services, sports press conferences</w:t>
-      </w:r>
-    </w:p>
-    <w:p>
-      <w:pPr>
-        <w:pStyle w:val="ListParagraph"/>
-        <w:numPr>
-          <w:ilvl w:val="0"/>
-          <w:numId w:val="1"/>
-        </w:numPr>
-        <w:spacing w:after="40"/>
-      </w:pPr>
-      <w:r>
-        <w:t xml:space="preserve">Job interviews, toasts at weddings, advocacy rallies</w:t>
-      </w:r>
-    </w:p>
-    <w:p>
-      <w:pPr>
-        <w:pStyle w:val="ListParagraph"/>
-        <w:numPr>
-          <w:ilvl w:val="0"/>
-          <w:numId w:val="1"/>
-        </w:numPr>
-        <w:spacing w:after="40"/>
-      </w:pPr>
-      <w:r>
-        <w:t xml:space="preserve">Podcasts, YouTube, community radio, local news</w:t>
-      </w:r>
-    </w:p>
-    <w:p>
-      <w:pPr>
-        <w:spacing w:after="80"/>
-      </w:pPr>
-      <w:r>
-        <w:rPr>
-          <w:b/>
-          <w:bCs/>
-        </w:rPr>
-        <w:t xml:space="preserve">The 3 Pillars: Voice, Body, Mind</w:t>
-      </w:r>
-    </w:p>
-    <w:p>
-      <w:pPr>
-        <w:pStyle w:val="ListParagraph"/>
-        <w:numPr>
-          <w:ilvl w:val="0"/>
-          <w:numId w:val="1"/>
-        </w:numPr>
-        <w:spacing w:after="40"/>
-      </w:pPr>
-      <w:r>
-        <w:t xml:space="preserve">VOICE — volume, pace, clarity, expression</w:t>
-      </w:r>
-    </w:p>
-    <w:p>
-      <w:pPr>
-        <w:pStyle w:val="ListParagraph"/>
-        <w:numPr>
-          <w:ilvl w:val="0"/>
-          <w:numId w:val="1"/>
-        </w:numPr>
-        <w:spacing w:after="40"/>
-      </w:pPr>
-      <w:r>
-        <w:t xml:space="preserve">BODY — posture, gestures, eye contact, taking up space</w:t>
-      </w:r>
-    </w:p>
-    <w:p>
-      <w:pPr>
-        <w:pStyle w:val="ListParagraph"/>
-        <w:numPr>
-          <w:ilvl w:val="0"/>
-          <w:numId w:val="1"/>
-        </w:numPr>
-        <w:spacing w:after="40"/>
-      </w:pPr>
-      <w:r>
-        <w:t xml:space="preserve">MIND — confidence, emotional expression, preparation, focus</w:t>
-      </w:r>
-    </w:p>
-    <w:p>
-      <w:pPr>
-        <w:spacing w:after="80"/>
-      </w:pPr>
-      <w:r>
-        <w:rPr>
-          <w:b/>
-          <w:bCs/>
-        </w:rPr>
-        <w:t xml:space="preserve">Class Norms</w:t>
-      </w:r>
-    </w:p>
-    <w:p>
-      <w:pPr>
-        <w:spacing w:after="80"/>
-      </w:pPr>
-      <w:r>
-        <w:t xml:space="preserve">Co-create 3-5 norms for being a great audience. Write them on the wall.</w:t>
-      </w:r>
-    </w:p>
-    <w:p>
-      <w:pPr>
-        <w:pStyle w:val="ListParagraph"/>
-        <w:numPr>
-          <w:ilvl w:val="0"/>
-          <w:numId w:val="1"/>
-        </w:numPr>
-        <w:spacing w:after="40"/>
-      </w:pPr>
-      <w:r>
-        <w:t xml:space="preserve">We are silent when someone is speaking.</w:t>
-      </w:r>
-    </w:p>
-    <w:p>
-      <w:pPr>
-        <w:pStyle w:val="ListParagraph"/>
-        <w:numPr>
-          <w:ilvl w:val="0"/>
-          <w:numId w:val="1"/>
-        </w:numPr>
-        <w:spacing w:after="40"/>
-      </w:pPr>
-      <w:r>
-        <w:t xml:space="preserve">We snap or clap — we never laugh at a speaker.</w:t>
-      </w:r>
-    </w:p>
-    <w:p>
-      <w:pPr>
-        <w:pStyle w:val="ListParagraph"/>
-        <w:numPr>
-          <w:ilvl w:val="0"/>
-          <w:numId w:val="1"/>
-        </w:numPr>
-        <w:spacing w:after="40"/>
-      </w:pPr>
-      <w:r>
-        <w:t xml:space="preserve">We give feedback to help, not to show off.</w:t>
-      </w:r>
-    </w:p>
-    <w:p>
-      <w:pPr>
-        <w:pStyle w:val="ListParagraph"/>
-        <w:numPr>
-          <w:ilvl w:val="0"/>
-          <w:numId w:val="1"/>
-        </w:numPr>
-        <w:spacing w:after="40"/>
-      </w:pPr>
-      <w:r>
-        <w:t xml:space="preserve">We try even when it's scary — especially when it's scary.</w:t>
-      </w:r>
+        <w:t xml:space="preserve">WRAP-UP (52–60 min)</w:t>
+      </w:r>
+    </w:p>
+    <w:p>
+      <w:pPr>
+        <w:spacing w:after="40"/>
+      </w:pPr>
+      <w:r>
+        <w:rPr>
+          <w:b/>
+          <w:bCs/>
+        </w:rPr>
+        <w:t xml:space="preserve">Reflection (52–57 min):</w:t>
+      </w:r>
+    </w:p>
+    <w:p>
+      <w:pPr>
+        <w:shd w:fill="2E5E8E" w:val="clear"/>
+        <w:spacing w:after="0" w:before="120"/>
+        <w:ind w:left="120"/>
+      </w:pPr>
+      <w:r>
+        <w:rPr>
+          <w:b/>
+          <w:bCs/>
+          <w:color w:val="ffffff"/>
+          <w:sz w:val="18"/>
+          <w:szCs w:val="18"/>
+        </w:rPr>
+        <w:t xml:space="preserve">SAY →</w:t>
+      </w:r>
+    </w:p>
+    <w:p>
+      <w:pPr>
+        <w:shd w:fill="EBF3FB" w:val="clear"/>
+        <w:spacing w:after="20"/>
+        <w:ind w:left="120"/>
+      </w:pPr>
+      <w:r>
+        <w:rPr>
+          <w:i/>
+          <w:iCs/>
+          <w:color w:val="1A3A5C"/>
+          <w:sz w:val="20"/>
+          <w:szCs w:val="20"/>
+        </w:rPr>
+        <w:t xml:space="preserve">"One word that describes how you feel about this class right now. Just one word. I'll go first."</w:t>
+      </w:r>
+    </w:p>
+    <w:p>
+      <w:pPr>
+        <w:shd w:fill="EBF3FB" w:val="clear"/>
+        <w:spacing w:after="100"/>
+      </w:pPr>
+    </w:p>
+    <w:p>
+      <w:pPr>
+        <w:pStyle w:val="ListParagraph"/>
+        <w:numPr>
+          <w:ilvl w:val="0"/>
+          <w:numId w:val="1"/>
+        </w:numPr>
+        <w:spacing w:after="40"/>
+      </w:pPr>
+      <w:r>
+        <w:t xml:space="preserve">Go around quickly — no sentences, just one word each. Teacher goes first.</w:t>
+      </w:r>
+    </w:p>
+    <w:p>
+      <w:pPr>
+        <w:pStyle w:val="ListParagraph"/>
+        <w:numPr>
+          <w:ilvl w:val="0"/>
+          <w:numId w:val="1"/>
+        </w:numPr>
+        <w:spacing w:after="40"/>
+      </w:pPr>
+      <w:r>
+        <w:t xml:space="preserve">Accept everything. Do not comment on individual words.</w:t>
+      </w:r>
+    </w:p>
+    <w:p>
+      <w:pPr>
+        <w:spacing w:after="40"/>
+      </w:pPr>
+      <w:r>
+        <w:rPr>
+          <w:b/>
+          <w:bCs/>
+        </w:rPr>
+        <w:t xml:space="preserve">Preview Week 2 (57–59 min):</w:t>
+      </w:r>
+    </w:p>
+    <w:p>
+      <w:pPr>
+        <w:shd w:fill="2E5E8E" w:val="clear"/>
+        <w:spacing w:after="0" w:before="120"/>
+        <w:ind w:left="120"/>
+      </w:pPr>
+      <w:r>
+        <w:rPr>
+          <w:b/>
+          <w:bCs/>
+          <w:color w:val="ffffff"/>
+          <w:sz w:val="18"/>
+          <w:szCs w:val="18"/>
+        </w:rPr>
+        <w:t xml:space="preserve">SAY →</w:t>
+      </w:r>
+    </w:p>
+    <w:p>
+      <w:pPr>
+        <w:shd w:fill="EBF3FB" w:val="clear"/>
+        <w:spacing w:after="20"/>
+        <w:ind w:left="120"/>
+      </w:pPr>
+      <w:r>
+        <w:rPr>
+          <w:i/>
+          <w:iCs/>
+          <w:color w:val="1A3A5C"/>
+          <w:sz w:val="20"/>
+          <w:szCs w:val="20"/>
+        </w:rPr>
+        <w:t xml:space="preserve">"Next week we zoom in on the first pillar: Voice. You will learn how to project, how to pace, and how to use silence as a tool. Between now and then: notice voices. In class, at home, in movies or podcasts. Ask yourself — what makes this person easy or hard to listen to?"</w:t>
+      </w:r>
+    </w:p>
+    <w:p>
+      <w:pPr>
+        <w:shd w:fill="EBF3FB" w:val="clear"/>
+        <w:spacing w:after="100"/>
+      </w:pPr>
+    </w:p>
+    <w:p>
+      <w:pPr>
+        <w:spacing w:after="40"/>
+      </w:pPr>
+      <w:r>
+        <w:rPr>
+          <w:b/>
+          <w:bCs/>
+        </w:rPr>
+        <w:t xml:space="preserve">Closing ritual (59–60 min):</w:t>
+      </w:r>
+    </w:p>
+    <w:p>
+      <w:pPr>
+        <w:pStyle w:val="ListParagraph"/>
+        <w:numPr>
+          <w:ilvl w:val="0"/>
+          <w:numId w:val="1"/>
+        </w:numPr>
+        <w:spacing w:after="40"/>
+      </w:pPr>
+      <w:r>
+        <w:t xml:space="preserve">All stand.</w:t>
+      </w:r>
+    </w:p>
+    <w:p>
+      <w:pPr>
+        <w:pStyle w:val="ListParagraph"/>
+        <w:numPr>
+          <w:ilvl w:val="0"/>
+          <w:numId w:val="1"/>
+        </w:numPr>
+        <w:spacing w:after="40"/>
+      </w:pPr>
+      <w:r>
+        <w:t xml:space="preserve">Class snaps together three times.</w:t>
+      </w:r>
+    </w:p>
+    <w:p>
+      <w:pPr>
+        <w:shd w:fill="2E5E8E" w:val="clear"/>
+        <w:spacing w:after="0" w:before="120"/>
+        <w:ind w:left="120"/>
+      </w:pPr>
+      <w:r>
+        <w:rPr>
+          <w:b/>
+          <w:bCs/>
+          <w:color w:val="ffffff"/>
+          <w:sz w:val="18"/>
+          <w:szCs w:val="18"/>
+        </w:rPr>
+        <w:t xml:space="preserve">SAY →</w:t>
+      </w:r>
+    </w:p>
+    <w:p>
+      <w:pPr>
+        <w:shd w:fill="EBF3FB" w:val="clear"/>
+        <w:spacing w:after="20"/>
+        <w:ind w:left="120"/>
+      </w:pPr>
+      <w:r>
+        <w:rPr>
+          <w:i/>
+          <w:iCs/>
+          <w:color w:val="1A3A5C"/>
+          <w:sz w:val="20"/>
+          <w:szCs w:val="20"/>
+        </w:rPr>
+        <w:t xml:space="preserve">"See you next week."</w:t>
+      </w:r>
+    </w:p>
+    <w:p>
+      <w:pPr>
+        <w:shd w:fill="EBF3FB" w:val="clear"/>
+        <w:spacing w:after="100"/>
+      </w:pPr>
     </w:p>
     <w:p>
       <w:pPr>
@@ -8898,7 +9839,7 @@
           <w:sz w:val="20"/>
           <w:szCs w:val="20"/>
         </w:rPr>
-        <w:t xml:space="preserve">• The first session sets the emotional tone for the whole year. Be warm and generous.</w:t>
+        <w:t xml:space="preserve">• The first session sets the emotional tone for the entire year. Be warm, generous, and willing to be vulnerable — modeling courage is the job.</w:t>
       </w:r>
     </w:p>
     <w:p>
@@ -8915,7 +9856,7 @@
           <w:sz w:val="20"/>
           <w:szCs w:val="20"/>
         </w:rPr>
-        <w:t xml:space="preserve">• Address nervousness directly: "Every single person here is nervous. That includes me."</w:t>
+        <w:t xml:space="preserve">• Address nervousness directly and early: "Every single person in this room is nervous right now — including me."</w:t>
       </w:r>
     </w:p>
     <w:p>
@@ -8932,7 +9873,58 @@
           <w:sz w:val="20"/>
           <w:szCs w:val="20"/>
         </w:rPr>
-        <w:t xml:space="preserve">• Students who help create norms follow them better — buy-in matters.</w:t>
+        <w:t xml:space="preserve">• Some students will rush their 30-second intro or go silent. Do not correct in the moment. The goal today is simply that everyone stands up.</w:t>
+      </w:r>
+    </w:p>
+    <w:p>
+      <w:pPr>
+        <w:shd w:fill="EEEEEE" w:val="clear"/>
+        <w:spacing w:after="20"/>
+        <w:ind w:left="120"/>
+      </w:pPr>
+      <w:r>
+        <w:rPr>
+          <w:i/>
+          <w:iCs/>
+          <w:color w:val="333333"/>
+          <w:sz w:val="20"/>
+          <w:szCs w:val="20"/>
+        </w:rPr>
+        <w:t xml:space="preserve">• Students who help create the norms own them. Do not rush Part 3 — the buy-in is the entire point of that section.</w:t>
+      </w:r>
+    </w:p>
+    <w:p>
+      <w:pPr>
+        <w:shd w:fill="EEEEEE" w:val="clear"/>
+        <w:spacing w:after="20"/>
+        <w:ind w:left="120"/>
+      </w:pPr>
+      <w:r>
+        <w:rPr>
+          <w:i/>
+          <w:iCs/>
+          <w:color w:val="333333"/>
+          <w:sz w:val="20"/>
+          <w:szCs w:val="20"/>
+        </w:rPr>
+        <w:t xml:space="preserve">• If you run short on time, compress Part 1 (brainstorm can be abbreviated). Parts 2 and 3 are essential — protect them.</w:t>
+      </w:r>
+    </w:p>
+    <w:p>
+      <w:pPr>
+        <w:shd w:fill="EEEEEE" w:val="clear"/>
+        <w:spacing w:after="20"/>
+        <w:ind w:left="120"/>
+      </w:pPr>
+      <w:r>
+        <w:rPr>
+          <w:i/>
+          <w:iCs/>
+          <w:color w:val="333333"/>
+          <w:sz w:val="20"/>
+          <w:szCs w:val="20"/>
+        </w:rPr>
+        <w:t xml:space="preserve">• Keep the 3 Pillars visible on the board or wall for the rest of the year. Refer back to them every session.</w:t>
       </w:r>
     </w:p>
     <w:p>

</xml_diff>